<commit_message>
feat: history of Russia signed report
</commit_message>
<xml_diff>
--- a/История России/Реферат/реферат.docx
+++ b/История России/Реферат/реферат.docx
@@ -14,6 +14,54 @@
         </w:rPr>
       </w:pPr>
       <w:r>
+        <w:drawing>
+          <wp:anchor distT="0" distB="0" distL="0" distR="0" simplePos="0" relativeHeight="2" behindDoc="0" locked="0" layoutInCell="1" allowOverlap="1">
+            <wp:simplePos x="0" y="0"/>
+            <wp:positionH relativeFrom="column">
+              <wp:posOffset>-981075</wp:posOffset>
+            </wp:positionH>
+            <wp:positionV relativeFrom="paragraph">
+              <wp:posOffset>-660400</wp:posOffset>
+            </wp:positionV>
+            <wp:extent cx="7529830" cy="10692130"/>
+            <wp:effectExtent l="0" t="0" r="0" b="0"/>
+            <wp:wrapNone/>
+            <wp:docPr id="1" name="Изображение1"/>
+            <wp:cNvGraphicFramePr>
+              <a:graphicFrameLocks xmlns:a="http://schemas.openxmlformats.org/drawingml/2006/main" noChangeAspect="1"/>
+            </wp:cNvGraphicFramePr>
+            <a:graphic xmlns:a="http://schemas.openxmlformats.org/drawingml/2006/main">
+              <a:graphicData uri="http://schemas.openxmlformats.org/drawingml/2006/picture">
+                <pic:pic xmlns:pic="http://schemas.openxmlformats.org/drawingml/2006/picture">
+                  <pic:nvPicPr>
+                    <pic:cNvPr id="1" name="Изображение1"/>
+                    <pic:cNvPicPr>
+                      <a:picLocks noChangeAspect="1" noChangeArrowheads="1"/>
+                    </pic:cNvPicPr>
+                  </pic:nvPicPr>
+                  <pic:blipFill>
+                    <a:blip r:embed="rId2"/>
+                    <a:stretch>
+                      <a:fillRect/>
+                    </a:stretch>
+                  </pic:blipFill>
+                  <pic:spPr bwMode="auto">
+                    <a:xfrm>
+                      <a:off x="0" y="0"/>
+                      <a:ext cx="7529830" cy="10692130"/>
+                    </a:xfrm>
+                    <a:prstGeom prst="rect">
+                      <a:avLst/>
+                    </a:prstGeom>
+                    <a:noFill/>
+                  </pic:spPr>
+                </pic:pic>
+              </a:graphicData>
+            </a:graphic>
+          </wp:anchor>
+        </w:drawing>
+      </w:r>
+      <w:r>
         <w:rPr>
           <w:rFonts w:eastAsia="Calibri"/>
           <w:sz w:val="28"/>
@@ -615,15 +663,7 @@
           <w:sz w:val="28"/>
           <w:szCs w:val="28"/>
         </w:rPr>
-        <w:t>Омск 202</w:t>
-      </w:r>
-      <w:r>
-        <w:rPr>
-          <w:rFonts w:eastAsia="Calibri"/>
-          <w:sz w:val="28"/>
-          <w:szCs w:val="28"/>
-        </w:rPr>
-        <w:t>6</w:t>
+        <w:t>Омск 2026</w:t>
       </w:r>
       <w:r>
         <w:br w:type="page"/>
@@ -811,7 +851,7 @@
           </w:r>
           <w:r>
             <w:rPr>
-              <w:rStyle w:val="Style16"/>
+              <w:rStyle w:val="user"/>
               <w:color w:val="000000"/>
               <w:sz w:val="28"/>
               <w:szCs w:val="28"/>
@@ -820,26 +860,31 @@
           </w:r>
           <w:r>
             <w:rPr>
-              <w:rStyle w:val="Style16"/>
+              <w:rStyle w:val="user"/>
               <w:color w:val="000000"/>
               <w:sz w:val="28"/>
               <w:szCs w:val="28"/>
             </w:rPr>
             <w:fldChar w:fldCharType="separate"/>
           </w:r>
-          <w:hyperlink w:anchor="__RefHeading___Toc13305_531594522" w:tooltip="Введение">
-            <w:r>
-              <w:rPr>
-                <w:rStyle w:val="Style16"/>
-                <w:color w:val="000000"/>
-                <w:sz w:val="28"/>
-                <w:szCs w:val="28"/>
-              </w:rPr>
-              <w:t>Введение</w:t>
-              <w:tab/>
-              <w:t>2</w:t>
-            </w:r>
-          </w:hyperlink>
+          <w:r>
+            <w:rPr>
+              <w:rStyle w:val="user"/>
+              <w:color w:val="000000"/>
+              <w:sz w:val="28"/>
+              <w:szCs w:val="28"/>
+            </w:rPr>
+            <w:t>Введение</w:t>
+          </w:r>
+          <w:r>
+            <w:rPr>
+              <w:color w:val="000000"/>
+              <w:sz w:val="28"/>
+              <w:szCs w:val="28"/>
+            </w:rPr>
+            <w:tab/>
+            <w:t>2</w:t>
+          </w:r>
         </w:p>
         <w:p>
           <w:pPr>
@@ -850,19 +895,16 @@
             </w:tabs>
             <w:rPr/>
           </w:pPr>
-          <w:hyperlink w:anchor="__RefHeading___Toc13307_531594522" w:tooltip="Цель работы">
-            <w:r>
-              <w:rPr>
-                <w:rStyle w:val="Style16"/>
-                <w:color w:val="000000"/>
-                <w:sz w:val="28"/>
-                <w:szCs w:val="28"/>
-              </w:rPr>
-              <w:t>Цель работы</w:t>
-              <w:tab/>
-              <w:t>2</w:t>
-            </w:r>
-          </w:hyperlink>
+          <w:r>
+            <w:rPr>
+              <w:color w:val="000000"/>
+              <w:sz w:val="28"/>
+              <w:szCs w:val="28"/>
+            </w:rPr>
+            <w:t>Цель работы</w:t>
+            <w:tab/>
+            <w:t>2</w:t>
+          </w:r>
         </w:p>
         <w:p>
           <w:pPr>
@@ -873,19 +915,16 @@
             </w:tabs>
             <w:rPr/>
           </w:pPr>
-          <w:hyperlink w:anchor="__RefHeading___Toc13309_531594522" w:tooltip="Глава 1. Эволюция официальных данных о потерях: от Сталина до современности">
-            <w:r>
-              <w:rPr>
-                <w:rStyle w:val="Style16"/>
-                <w:color w:val="000000"/>
-                <w:sz w:val="28"/>
-                <w:szCs w:val="28"/>
-              </w:rPr>
-              <w:t>Глава 1. Эволюция официальных данных о потерях: от Сталина до современности</w:t>
-              <w:tab/>
-              <w:t>4</w:t>
-            </w:r>
-          </w:hyperlink>
+          <w:r>
+            <w:rPr>
+              <w:color w:val="000000"/>
+              <w:sz w:val="28"/>
+              <w:szCs w:val="28"/>
+            </w:rPr>
+            <w:t>Глава 1. Эволюция официальных данных о потерях: от Сталина до современности</w:t>
+            <w:tab/>
+            <w:t>4</w:t>
+          </w:r>
         </w:p>
         <w:p>
           <w:pPr>
@@ -896,19 +935,16 @@
             </w:tabs>
             <w:rPr/>
           </w:pPr>
-          <w:hyperlink w:anchor="__RefHeading___Toc13311_531594522" w:tooltip="Глава 2. Методология подсчета: балансовый метод и поименные списки">
-            <w:r>
-              <w:rPr>
-                <w:rStyle w:val="Style16"/>
-                <w:color w:val="000000"/>
-                <w:sz w:val="28"/>
-                <w:szCs w:val="28"/>
-              </w:rPr>
-              <w:t>Глава 2. Методология подсчета: балансовый метод и поименные списки</w:t>
-              <w:tab/>
-              <w:t>5</w:t>
-            </w:r>
-          </w:hyperlink>
+          <w:r>
+            <w:rPr>
+              <w:color w:val="000000"/>
+              <w:sz w:val="28"/>
+              <w:szCs w:val="28"/>
+            </w:rPr>
+            <w:t>Глава 2. Методология подсчета: балансовый метод и поименные списки</w:t>
+            <w:tab/>
+            <w:t>5</w:t>
+          </w:r>
         </w:p>
         <w:p>
           <w:pPr>
@@ -919,19 +955,16 @@
             </w:tabs>
             <w:rPr/>
           </w:pPr>
-          <w:hyperlink w:anchor="__RefHeading___Toc13313_531594522" w:tooltip="Глава 3. Безвозвратные потери Вооруженных Сил СССР">
-            <w:r>
-              <w:rPr>
-                <w:rStyle w:val="Style16"/>
-                <w:color w:val="000000"/>
-                <w:sz w:val="28"/>
-                <w:szCs w:val="28"/>
-              </w:rPr>
-              <w:t>Глава 3. Безвозвратные потери Вооруженных Сил СССР</w:t>
-              <w:tab/>
-              <w:t>6</w:t>
-            </w:r>
-          </w:hyperlink>
+          <w:r>
+            <w:rPr>
+              <w:color w:val="000000"/>
+              <w:sz w:val="28"/>
+              <w:szCs w:val="28"/>
+            </w:rPr>
+            <w:t>Глава 3. Безвозвратные потери Вооруженных Сил СССР</w:t>
+            <w:tab/>
+            <w:t>6</w:t>
+          </w:r>
         </w:p>
         <w:p>
           <w:pPr>
@@ -942,19 +975,16 @@
             </w:tabs>
             <w:rPr/>
           </w:pPr>
-          <w:hyperlink w:anchor="__RefHeading___Toc13315_531594522" w:tooltip="Глава 4. Трагедия гражданского населения: категории и причины жертв">
-            <w:r>
-              <w:rPr>
-                <w:rStyle w:val="Style16"/>
-                <w:color w:val="000000"/>
-                <w:sz w:val="28"/>
-                <w:szCs w:val="28"/>
-              </w:rPr>
-              <w:t>Глава 4. Трагедия гражданского населения: категории и причины жертв</w:t>
-              <w:tab/>
-              <w:t>7</w:t>
-            </w:r>
-          </w:hyperlink>
+          <w:r>
+            <w:rPr>
+              <w:color w:val="000000"/>
+              <w:sz w:val="28"/>
+              <w:szCs w:val="28"/>
+            </w:rPr>
+            <w:t>Глава 4. Трагедия гражданского населения: категории и причины жертв</w:t>
+            <w:tab/>
+            <w:t>7</w:t>
+          </w:r>
         </w:p>
         <w:p>
           <w:pPr>
@@ -965,19 +995,16 @@
             </w:tabs>
             <w:rPr/>
           </w:pPr>
-          <w:hyperlink w:anchor="__RefHeading___Toc13317_531594522" w:tooltip="Глава 5. Проблема советских военнопленных в современной историографии">
-            <w:r>
-              <w:rPr>
-                <w:rStyle w:val="Style16"/>
-                <w:color w:val="000000"/>
-                <w:sz w:val="28"/>
-                <w:szCs w:val="28"/>
-              </w:rPr>
-              <w:t>Глава 5. Проблема советских военнопленных в современной историографии</w:t>
-              <w:tab/>
-              <w:t>8</w:t>
-            </w:r>
-          </w:hyperlink>
+          <w:r>
+            <w:rPr>
+              <w:color w:val="000000"/>
+              <w:sz w:val="28"/>
+              <w:szCs w:val="28"/>
+            </w:rPr>
+            <w:t>Глава 5. Проблема советских военнопленных в современной историографии</w:t>
+            <w:tab/>
+            <w:t>8</w:t>
+          </w:r>
         </w:p>
         <w:p>
           <w:pPr>
@@ -988,19 +1015,16 @@
             </w:tabs>
             <w:rPr/>
           </w:pPr>
-          <w:hyperlink w:anchor="__RefHeading___Toc13319_531594522" w:tooltip="Глава 6. Демографическое эхо войны: долгосрочные последствия для страны">
-            <w:r>
-              <w:rPr>
-                <w:rStyle w:val="Style16"/>
-                <w:color w:val="000000"/>
-                <w:sz w:val="28"/>
-                <w:szCs w:val="28"/>
-              </w:rPr>
-              <w:t>Глава 6. Демографическое эхо войны: долгосрочные последствия для страны</w:t>
-              <w:tab/>
-              <w:t>9</w:t>
-            </w:r>
-          </w:hyperlink>
+          <w:r>
+            <w:rPr>
+              <w:color w:val="000000"/>
+              <w:sz w:val="28"/>
+              <w:szCs w:val="28"/>
+            </w:rPr>
+            <w:t>Глава 6. Демографическое эхо войны: долгосрочные последствия для страны</w:t>
+            <w:tab/>
+            <w:t>9</w:t>
+          </w:r>
         </w:p>
         <w:p>
           <w:pPr>
@@ -1011,19 +1035,16 @@
             </w:tabs>
             <w:rPr/>
           </w:pPr>
-          <w:hyperlink w:anchor="__RefHeading___Toc13321_531594522" w:tooltip="Заключение">
-            <w:r>
-              <w:rPr>
-                <w:rStyle w:val="Style16"/>
-                <w:color w:val="000000"/>
-                <w:sz w:val="28"/>
-                <w:szCs w:val="28"/>
-              </w:rPr>
-              <w:t>Заключение</w:t>
-              <w:tab/>
-              <w:t>11</w:t>
-            </w:r>
-          </w:hyperlink>
+          <w:r>
+            <w:rPr>
+              <w:color w:val="000000"/>
+              <w:sz w:val="28"/>
+              <w:szCs w:val="28"/>
+            </w:rPr>
+            <w:t>Заключение</w:t>
+            <w:tab/>
+            <w:t>11</w:t>
+          </w:r>
         </w:p>
         <w:p>
           <w:pPr>
@@ -1034,22 +1055,18 @@
             </w:tabs>
             <w:rPr/>
           </w:pPr>
-          <w:hyperlink w:anchor="__RefHeading___Toc13323_531594522" w:tooltip="Библиографический список">
-            <w:r>
-              <w:rPr>
-                <w:rStyle w:val="Style16"/>
-                <w:color w:val="000000"/>
-                <w:sz w:val="28"/>
-                <w:szCs w:val="28"/>
-              </w:rPr>
-              <w:t>Библиографический список</w:t>
-              <w:tab/>
-              <w:t>12</w:t>
-            </w:r>
-          </w:hyperlink>
           <w:r>
             <w:rPr>
-              <w:rStyle w:val="Style16"/>
+              <w:color w:val="000000"/>
+              <w:sz w:val="28"/>
+              <w:szCs w:val="28"/>
+            </w:rPr>
+            <w:t>Библиографический список</w:t>
+            <w:tab/>
+            <w:t>12</w:t>
+          </w:r>
+          <w:r>
+            <w:rPr>
               <w:color w:val="000000"/>
               <w:sz w:val="28"/>
               <w:szCs w:val="28"/>
@@ -1088,7 +1105,7 @@
         <w:pStyle w:val="Heading1"/>
         <w:widowControl w:val="false"/>
         <w:bidi w:val="0"/>
-        <w:spacing w:before="72" w:after="0"/>
+        <w:spacing w:before="0" w:after="0"/>
         <w:ind w:hanging="0" w:start="113" w:end="0"/>
         <w:jc w:val="center"/>
         <w:rPr/>
@@ -1652,7 +1669,7 @@
         <w:pStyle w:val="Heading1"/>
         <w:widowControl w:val="false"/>
         <w:bidi w:val="0"/>
-        <w:spacing w:before="72" w:after="0"/>
+        <w:spacing w:before="0" w:after="0"/>
         <w:ind w:hanging="0" w:start="170" w:end="0"/>
         <w:jc w:val="center"/>
         <w:rPr/>
@@ -1702,7 +1719,7 @@
         <w:pStyle w:val="Heading1"/>
         <w:widowControl w:val="false"/>
         <w:bidi w:val="0"/>
-        <w:spacing w:before="72" w:after="0"/>
+        <w:spacing w:before="0" w:after="0"/>
         <w:ind w:hanging="0" w:start="170" w:end="0"/>
         <w:jc w:val="center"/>
         <w:rPr/>
@@ -1873,9 +1890,9 @@
       </w:r>
     </w:p>
     <w:sectPr>
-      <w:footerReference w:type="even" r:id="rId2"/>
-      <w:footerReference w:type="default" r:id="rId3"/>
-      <w:footerReference w:type="first" r:id="rId4"/>
+      <w:footerReference w:type="even" r:id="rId3"/>
+      <w:footerReference w:type="default" r:id="rId4"/>
+      <w:footerReference w:type="first" r:id="rId5"/>
       <w:type w:val="nextPage"/>
       <w:pgSz w:w="11906" w:h="16838"/>
       <w:pgMar w:left="1559" w:right="708" w:gutter="0" w:header="0" w:top="1040" w:footer="1143" w:bottom="1340"/>
@@ -1934,7 +1951,7 @@
         </w:r>
         <w:r>
           <w:rPr/>
-          <w:t>12</w:t>
+          <w:t>14</w:t>
         </w:r>
         <w:r>
           <w:rPr/>
@@ -2870,6 +2887,7 @@
     <w:rsid w:val="00587247"/>
     <w:pPr>
       <w:widowControl w:val="false"/>
+      <w:suppressAutoHyphens w:val="true"/>
       <w:bidi w:val="0"/>
       <w:spacing w:before="0" w:after="0"/>
       <w:jc w:val="start"/>
@@ -2959,17 +2977,17 @@
       <w:u w:val="single"/>
     </w:rPr>
   </w:style>
-  <w:style w:type="character" w:styleId="Style16">
-    <w:name w:val="Ссылка указателя"/>
+  <w:style w:type="character" w:styleId="user">
+    <w:name w:val="Ссылка указателя (user)"/>
     <w:qFormat/>
     <w:rPr/>
   </w:style>
-  <w:style w:type="character" w:styleId="Style17">
-    <w:name w:val="Символ нумерации"/>
+  <w:style w:type="character" w:styleId="user1">
+    <w:name w:val="Символ нумерации (user)"/>
     <w:qFormat/>
     <w:rPr/>
   </w:style>
-  <w:style w:type="paragraph" w:styleId="Style18">
+  <w:style w:type="paragraph" w:styleId="Style16">
     <w:name w:val="Заголовок"/>
     <w:basedOn w:val="Normal"/>
     <w:next w:val="BodyText"/>
@@ -2979,7 +2997,7 @@
       <w:spacing w:before="240" w:after="120"/>
     </w:pPr>
     <w:rPr>
-      <w:rFonts w:ascii="Liberation Sans" w:hAnsi="Liberation Sans" w:eastAsia="Noto Sans" w:cs="Noto Sans Devanagari"/>
+      <w:rFonts w:ascii="Liberation Sans" w:hAnsi="Liberation Sans" w:eastAsia="Chiron Hei HK ExtraLight" w:cs="Matangi Light"/>
       <w:sz w:val="28"/>
       <w:szCs w:val="28"/>
     </w:rPr>
@@ -3021,8 +3039,34 @@
       <w:szCs w:val="24"/>
     </w:rPr>
   </w:style>
-  <w:style w:type="paragraph" w:styleId="Style19">
+  <w:style w:type="paragraph" w:styleId="Style17">
     <w:name w:val="Указатель"/>
+    <w:basedOn w:val="Normal"/>
+    <w:qFormat/>
+    <w:pPr>
+      <w:suppressLineNumbers/>
+    </w:pPr>
+    <w:rPr>
+      <w:rFonts w:cs="Matangi Light"/>
+    </w:rPr>
+  </w:style>
+  <w:style w:type="paragraph" w:styleId="user2">
+    <w:name w:val="Заголовок (user)"/>
+    <w:basedOn w:val="Normal"/>
+    <w:next w:val="BodyText"/>
+    <w:qFormat/>
+    <w:pPr>
+      <w:keepNext w:val="true"/>
+      <w:spacing w:before="240" w:after="120"/>
+    </w:pPr>
+    <w:rPr>
+      <w:rFonts w:ascii="Liberation Sans" w:hAnsi="Liberation Sans" w:eastAsia="Noto Sans" w:cs="Noto Sans Devanagari"/>
+      <w:sz w:val="28"/>
+      <w:szCs w:val="28"/>
+    </w:rPr>
+  </w:style>
+  <w:style w:type="paragraph" w:styleId="user3">
+    <w:name w:val="Указатель (user)"/>
     <w:basedOn w:val="Normal"/>
     <w:qFormat/>
     <w:pPr>
@@ -3051,7 +3095,14 @@
     <w:pPr/>
     <w:rPr/>
   </w:style>
-  <w:style w:type="paragraph" w:styleId="Style20">
+  <w:style w:type="paragraph" w:styleId="user4">
+    <w:name w:val="Колонтитулы (user)"/>
+    <w:basedOn w:val="Normal"/>
+    <w:qFormat/>
+    <w:pPr/>
+    <w:rPr/>
+  </w:style>
+  <w:style w:type="paragraph" w:styleId="Style18">
     <w:name w:val="Колонтитулы"/>
     <w:basedOn w:val="Normal"/>
     <w:qFormat/>
@@ -3092,7 +3143,7 @@
   </w:style>
   <w:style w:type="paragraph" w:styleId="IndexHeading">
     <w:name w:val="index heading"/>
-    <w:basedOn w:val="Style18"/>
+    <w:basedOn w:val="user2"/>
     <w:pPr/>
     <w:rPr/>
   </w:style>
@@ -3132,6 +3183,7 @@
     <w:rsid w:val="00870556"/>
     <w:pPr>
       <w:widowControl w:val="false"/>
+      <w:suppressAutoHyphens w:val="true"/>
       <w:bidi w:val="0"/>
       <w:spacing w:lineRule="auto" w:line="360" w:before="0" w:after="0"/>
       <w:ind w:firstLine="57"/>
@@ -3162,8 +3214,8 @@
     </w:pPr>
     <w:rPr/>
   </w:style>
-  <w:style w:type="numbering" w:styleId="Style21" w:default="1">
-    <w:name w:val="Без списка"/>
+  <w:style w:type="numbering" w:styleId="user5" w:default="1">
+    <w:name w:val="Без списка (user)"/>
     <w:uiPriority w:val="99"/>
     <w:semiHidden/>
     <w:unhideWhenUsed/>

</xml_diff>